<commit_message>
Archivos modificados según información reciente
</commit_message>
<xml_diff>
--- a/Fase 1/Evidencias Grupales/1.4_APT122_FormativaFase1.docx
+++ b/Fase 1/Evidencias Grupales/1.4_APT122_FormativaFase1.docx
@@ -483,7 +483,7 @@
     </w:p>
     <w:sdt>
       <w:sdtPr>
-        <w:id w:val="-738433781"/>
+        <w:id w:val="-1376085742"/>
         <w:docPartObj>
           <w:docPartGallery w:val="Table of Contents"/>
           <w:docPartUnique w:val="1"/>
@@ -1283,7 +1283,7 @@
           <w:rFonts w:ascii="Calibri" w:cs="Calibri" w:eastAsia="Calibri" w:hAnsi="Calibri"/>
           <w:rtl w:val="0"/>
         </w:rPr>
-        <w:t xml:space="preserve">The WellQ project is to establish a backend that powers a health-and-wellness mobile application by unifying data from multiple wearable devices. Its main objective is to receive data from Whoop, Garmin, Fitbit and Oura devices and normalize their readings into one unified metrics model (heartrate, steps, hrv_rmssd, spo2, breathing_rate and active calories). The solution implements secure authentication and re-implements the nine query endpoints the app already consumes today. This project will provide a new production backend for WellQ, that makes multi-device health tracking simple and consistent for the medical staff and their patients.</w:t>
+        <w:t xml:space="preserve">The WellQ project is to establish a platform that powers a health-and-wellness mobile application by unifying data from multiple wearable devices. Its main objective is to receive data from Whoop, Garmin, Fitbit and Oura devices (and more providers) normalizing their readings into one unified metrics model (heartrate, steps, hrv_rmssd, spo2, breathing_rate and active calories). The solution implements secure authentication and re-implements the nine query endpoints the app already consumes today. This project will provide a new production platform just as its current one (Spike) for WellQ, that makes multi-device health tracking simple and consistent for the medical staff and their patients.</w:t>
       </w:r>
     </w:p>
     <w:p>
@@ -1362,6 +1362,7 @@
     </w:p>
     <w:p>
       <w:pPr>
+        <w:spacing w:after="240" w:before="240" w:lineRule="auto"/>
         <w:ind w:firstLine="720"/>
         <w:jc w:val="both"/>
         <w:rPr>
@@ -1373,20 +1374,32 @@
           <w:rFonts w:ascii="Calibri" w:cs="Calibri" w:eastAsia="Calibri" w:hAnsi="Calibri"/>
           <w:rtl w:val="0"/>
         </w:rPr>
-        <w:t xml:space="preserve">El proyecto WellQ es establecer un backend que de soporte a una aplicación móvil de salud y bienestar al unificar los datos procedentes de varios dispositivos portátiles. Su objetivo principal es recibir datos de dispositivos Whoop, Garmin, Fitbit y Oura y normalizar sus lecturas en un modelo unificado de métricas (frecuencia cardíaca, pasos, HRV-RMSSD, SpO2, frecuencia respiratoria y calorías activas). La solución implementa una autenticación segura y re-implementa los nueve endpoints de consulta que la app ya consume hoy en día. Este proyecto proporcionará un nuevo backend de producción para WellQ, que hará simple y consistente el seguimiento de la salud multi-dispositivo para el personal médico y sus pacientes.</w:t>
-      </w:r>
-    </w:p>
-    <w:p>
-      <w:pPr>
-        <w:jc w:val="both"/>
-        <w:rPr>
-          <w:rFonts w:ascii="Calibri" w:cs="Calibri" w:eastAsia="Calibri" w:hAnsi="Calibri"/>
-        </w:rPr>
-      </w:pPr>
-      <w:r>
-        <w:rPr>
-          <w:rtl w:val="0"/>
-        </w:rPr>
+        <w:t xml:space="preserve">El proyecto WellQ consiste en establecer una plataforma que impulsa una aplicación móvil de salud y bienestar unificando los datos de múltiples dispositivos wearables. Su objetivo principal es recibir datos de dispositivos Whoop, Garmin, Fitbit y Oura (y más proveedores), normalizando sus lecturas en un modelo unificado de métricas (frecuencia cardíaca, pasos, hrv_rmssd, spo2, frecuencia respiratoria y calorías activas). La solución implementa autenticación segura y vuelve a implementar los nueve endpoints de consulta que la aplicación ya consume actualmente. Este proyecto proporcionará una nueva plataforma de producción, igual que la actual (Spike) para WellQ, que hace que el seguimiento de salud multi-dispositivo sea simple y consistente para el personal médico y sus pacientes.</w:t>
+      </w:r>
+    </w:p>
+    <w:p>
+      <w:pPr>
+        <w:spacing w:after="240" w:before="240" w:lineRule="auto"/>
+        <w:jc w:val="both"/>
+        <w:rPr>
+          <w:rFonts w:ascii="Calibri" w:cs="Calibri" w:eastAsia="Calibri" w:hAnsi="Calibri"/>
+        </w:rPr>
+      </w:pPr>
+      <w:r>
+        <w:rPr>
+          <w:rFonts w:ascii="Calibri" w:cs="Calibri" w:eastAsia="Calibri" w:hAnsi="Calibri"/>
+          <w:b w:val="1"/>
+          <w:bCs w:val="1"/>
+          <w:rtl w:val="0"/>
+        </w:rPr>
+        <w:t xml:space="preserve">Palabras clave:</w:t>
+      </w:r>
+      <w:r>
+        <w:rPr>
+          <w:rFonts w:ascii="Calibri" w:cs="Calibri" w:eastAsia="Calibri" w:hAnsi="Calibri"/>
+          <w:rtl w:val="0"/>
+        </w:rPr>
+        <w:t xml:space="preserve"> Health tech, integración de wearables, REST API, autenticación JWT, normalización de datos, aplicación móvil, ISO 25010.</w:t>
       </w:r>
     </w:p>
     <w:p>
@@ -1399,10 +1412,8 @@
       </w:pPr>
       <w:r>
         <w:rPr>
-          <w:rFonts w:ascii="Calibri" w:cs="Calibri" w:eastAsia="Calibri" w:hAnsi="Calibri"/>
-          <w:rtl w:val="0"/>
-        </w:rPr>
-        <w:t xml:space="preserve">Palabras clave: Salud digital, integración de wearables, API REST, autenticación JWT, normalización de datos, aplicación móvil, ISO 25010.</w:t>
+          <w:rtl w:val="0"/>
+        </w:rPr>
       </w:r>
     </w:p>
     <w:p>
@@ -1713,7 +1724,7 @@
           <w:rFonts w:ascii="Calibri" w:cs="Calibri" w:eastAsia="Calibri" w:hAnsi="Calibri"/>
           <w:rtl w:val="0"/>
         </w:rPr>
-        <w:t xml:space="preserve">Se espera construir un backend propio, operando como servidor independiente, que la app WellQ pueda consumir apuntando a él en lugar de spikeapi.com, con comportamiento equivalente y datos reales de los proveedores asignados, implementando un módulo de autenticación compatible con el flujo actual de la app.</w:t>
+        <w:t xml:space="preserve">Se espera construir una plataforma propia, operando como servidor independiente, que la app WellQ pueda consumir apuntando a él en lugar de spikeapi.com, con comportamiento equivalente y datos reales de los proveedores asignados, implementando un módulo de autenticación compatible con el flujo actual de la app.</w:t>
       </w:r>
     </w:p>
     <w:p>
@@ -2032,7 +2043,7 @@
           <w:rFonts w:ascii="Calibri" w:cs="Calibri" w:eastAsia="Calibri" w:hAnsi="Calibri"/>
           <w:rtl w:val="0"/>
         </w:rPr>
-        <w:t xml:space="preserve">El proyecto al ser proporcionado por Alloxentric permite trabajar con un proyecto de escala real. La duración del proyecto deberá coincidir con la duración de la asignatura de Capstone (aproximadamente 3 meses)  y Alloxentric nos entrega las herramientas necesarias para poder llevarlo a cabo, aumentando en gran parte la factibilidad del desarrollo. Se va a necesitar un equipo que permita realizar las pruebas con la API actual y que permita construir el nuevo backend. Algunos factores que pueden perjudicar la duración del proyecto es el hecho de que no tenemos mucha experiencia con un backend, y eso puede ralentizar los resultados finales, pero con el apoyo de la documentación y el soporte de los stakeholders podemos intentar solventar las dudas que tengamos en la realización del proyecto.</w:t>
+        <w:t xml:space="preserve">El proyecto al ser proporcionado por Alloxentric permite trabajar con un proyecto de escala real. La duración del proyecto deberá coincidir con la duración de la asignatura de Capstone (aproximadamente 3 meses)  y Alloxentric nos entrega las herramientas necesarias para poder llevarlo a cabo, aumentando en gran parte la factibilidad del desarrollo. Se va a necesitar un equipo que permita realizar las pruebas con la API actual y que permita construir la nueva plataforma. Algunos factores que pueden perjudicar la duración del proyecto es el hecho de que no tenemos mucha experiencia con un backend, y eso puede ralentizar los resultados finales, pero con el apoyo de la documentación y el soporte de los stakeholders podemos intentar solventar las dudas que tengamos en la realización del proyecto.</w:t>
       </w:r>
       <w:r>
         <w:rPr>
@@ -2082,7 +2093,7 @@
           <w:rFonts w:ascii="Calibri" w:cs="Calibri" w:eastAsia="Calibri" w:hAnsi="Calibri"/>
           <w:rtl w:val="0"/>
         </w:rPr>
-        <w:t xml:space="preserve">In this project, we presented the new WellQ Backend. Our solution integrates multiple real-world data sources while delivering a unique abstraction layer, demonstrating strong potential to satisfy the needs of wellness applications built on top of it. This is not only a backend; it is a foundation that improves the overall user experience and opens the door to richer health features in the future for WellQ.</w:t>
+        <w:t xml:space="preserve">In this project, we presented the new WellQ API Platform. Our solution integrates multiple real-world data sources while delivering a unique abstraction layer, demonstrating strong potential to satisfy the needs of wellness applications built on top of it. This is not only a platform; it is a foundation that improves the overall user experience and opens the door to richer health features in the future for WellQ.</w:t>
       </w:r>
       <w:r>
         <w:rPr>

</xml_diff>